<commit_message>
Comp math Lab-1 DONE
</commit_message>
<xml_diff>
--- a/Computation math/Comp_lab_1/Выч Мат ЛР1 P3215  Линейский А.Е..docx
+++ b/Computation math/Comp_lab_1/Выч Мат ЛР1 P3215  Линейский А.Е..docx
@@ -351,10 +351,11 @@
         <w:t>6</w:t>
       </w:r>
     </w:p>
-    <w:bookmarkStart w:id="0" w:name="_Toc178447396" w:displacedByCustomXml="next"/>
-    <w:bookmarkStart w:id="1" w:name="_Toc178448813" w:displacedByCustomXml="next"/>
+    <w:bookmarkStart w:id="0" w:name="_Toc222415931" w:displacedByCustomXml="next"/>
+    <w:bookmarkStart w:id="1" w:name="_Toc182062724" w:displacedByCustomXml="next"/>
     <w:bookmarkStart w:id="2" w:name="_Toc178448935" w:displacedByCustomXml="next"/>
-    <w:bookmarkStart w:id="3" w:name="_Toc182062724" w:displacedByCustomXml="next"/>
+    <w:bookmarkStart w:id="3" w:name="_Toc178448813" w:displacedByCustomXml="next"/>
+    <w:bookmarkStart w:id="4" w:name="_Toc178447396" w:displacedByCustomXml="next"/>
     <w:sdt>
       <w:sdtPr>
         <w:rPr>
@@ -381,6 +382,7 @@
           <w:r>
             <w:t>Содержание</w:t>
           </w:r>
+          <w:bookmarkEnd w:id="4"/>
           <w:bookmarkEnd w:id="3"/>
           <w:bookmarkEnd w:id="2"/>
           <w:bookmarkEnd w:id="1"/>
@@ -402,18 +404,19 @@
               <w:rFonts w:asciiTheme="minorHAnsi" w:eastAsiaTheme="minorEastAsia" w:hAnsiTheme="minorHAnsi"/>
               <w:noProof/>
               <w:kern w:val="2"/>
-              <w:sz w:val="22"/>
+              <w:sz w:val="24"/>
+              <w:szCs w:val="24"/>
               <w:lang w:eastAsia="ru-RU"/>
               <w14:ligatures w14:val="standardContextual"/>
             </w:rPr>
           </w:pPr>
-          <w:hyperlink w:anchor="_Toc182062725" w:history="1">
+          <w:hyperlink w:anchor="_Toc222415931" w:history="1">
             <w:r>
               <w:rPr>
                 <w:rStyle w:val="aa"/>
                 <w:noProof/>
               </w:rPr>
-              <w:t>Задание</w:t>
+              <w:t>Содержание</w:t>
             </w:r>
             <w:r>
               <w:rPr>
@@ -434,23 +437,27 @@
                 <w:noProof/>
                 <w:webHidden/>
               </w:rPr>
-              <w:instrText xml:space="preserve"> PAGEREF _Toc182062725 \h </w:instrText>
+              <w:instrText xml:space="preserve"> PAGEREF _Toc222415931 \h </w:instrText>
             </w:r>
             <w:r>
               <w:rPr>
                 <w:noProof/>
                 <w:webHidden/>
               </w:rPr>
-              <w:fldChar w:fldCharType="separate"/>
-            </w:r>
-            <w:r>
-              <w:rPr>
-                <w:b/>
-                <w:bCs/>
+            </w:r>
+            <w:r>
+              <w:rPr>
                 <w:noProof/>
                 <w:webHidden/>
               </w:rPr>
-              <w:t>Ошибка! Закладка не определена.</w:t>
+              <w:fldChar w:fldCharType="separate"/>
+            </w:r>
+            <w:r>
+              <w:rPr>
+                <w:noProof/>
+                <w:webHidden/>
+              </w:rPr>
+              <w:t>2</w:t>
             </w:r>
             <w:r>
               <w:rPr>
@@ -468,18 +475,19 @@
               <w:rFonts w:asciiTheme="minorHAnsi" w:eastAsiaTheme="minorEastAsia" w:hAnsiTheme="minorHAnsi"/>
               <w:noProof/>
               <w:kern w:val="2"/>
-              <w:sz w:val="22"/>
+              <w:sz w:val="24"/>
+              <w:szCs w:val="24"/>
               <w:lang w:eastAsia="ru-RU"/>
               <w14:ligatures w14:val="standardContextual"/>
             </w:rPr>
           </w:pPr>
-          <w:hyperlink w:anchor="_Toc182062726" w:history="1">
+          <w:hyperlink w:anchor="_Toc222415932" w:history="1">
             <w:r>
               <w:rPr>
                 <w:rStyle w:val="aa"/>
                 <w:noProof/>
               </w:rPr>
-              <w:t>Диаграмма классов</w:t>
+              <w:t>Цель</w:t>
             </w:r>
             <w:r>
               <w:rPr>
@@ -500,23 +508,27 @@
                 <w:noProof/>
                 <w:webHidden/>
               </w:rPr>
-              <w:instrText xml:space="preserve"> PAGEREF _Toc182062726 \h </w:instrText>
+              <w:instrText xml:space="preserve"> PAGEREF _Toc222415932 \h </w:instrText>
             </w:r>
             <w:r>
               <w:rPr>
                 <w:noProof/>
                 <w:webHidden/>
               </w:rPr>
-              <w:fldChar w:fldCharType="separate"/>
-            </w:r>
-            <w:r>
-              <w:rPr>
-                <w:b/>
-                <w:bCs/>
+            </w:r>
+            <w:r>
+              <w:rPr>
                 <w:noProof/>
                 <w:webHidden/>
               </w:rPr>
-              <w:t>Ошибка! Закладка не определена.</w:t>
+              <w:fldChar w:fldCharType="separate"/>
+            </w:r>
+            <w:r>
+              <w:rPr>
+                <w:noProof/>
+                <w:webHidden/>
+              </w:rPr>
+              <w:t>3</w:t>
             </w:r>
             <w:r>
               <w:rPr>
@@ -534,18 +546,19 @@
               <w:rFonts w:asciiTheme="minorHAnsi" w:eastAsiaTheme="minorEastAsia" w:hAnsiTheme="minorHAnsi"/>
               <w:noProof/>
               <w:kern w:val="2"/>
-              <w:sz w:val="22"/>
+              <w:sz w:val="24"/>
+              <w:szCs w:val="24"/>
               <w:lang w:eastAsia="ru-RU"/>
               <w14:ligatures w14:val="standardContextual"/>
             </w:rPr>
           </w:pPr>
-          <w:hyperlink w:anchor="_Toc182062727" w:history="1">
+          <w:hyperlink w:anchor="_Toc222415933" w:history="1">
             <w:r>
               <w:rPr>
                 <w:rStyle w:val="aa"/>
                 <w:noProof/>
               </w:rPr>
-              <w:t>Исходный код программы</w:t>
+              <w:t>Описание метода</w:t>
             </w:r>
             <w:r>
               <w:rPr>
@@ -566,7 +579,7 @@
                 <w:noProof/>
                 <w:webHidden/>
               </w:rPr>
-              <w:instrText xml:space="preserve"> PAGEREF _Toc182062727 \h </w:instrText>
+              <w:instrText xml:space="preserve"> PAGEREF _Toc222415933 \h </w:instrText>
             </w:r>
             <w:r>
               <w:rPr>
@@ -586,7 +599,7 @@
                 <w:noProof/>
                 <w:webHidden/>
               </w:rPr>
-              <w:t>4</w:t>
+              <w:t>3</w:t>
             </w:r>
             <w:r>
               <w:rPr>
@@ -604,18 +617,19 @@
               <w:rFonts w:asciiTheme="minorHAnsi" w:eastAsiaTheme="minorEastAsia" w:hAnsiTheme="minorHAnsi"/>
               <w:noProof/>
               <w:kern w:val="2"/>
-              <w:sz w:val="22"/>
+              <w:sz w:val="24"/>
+              <w:szCs w:val="24"/>
               <w:lang w:eastAsia="ru-RU"/>
               <w14:ligatures w14:val="standardContextual"/>
             </w:rPr>
           </w:pPr>
-          <w:hyperlink w:anchor="_Toc182062728" w:history="1">
+          <w:hyperlink w:anchor="_Toc222415934" w:history="1">
             <w:r>
               <w:rPr>
                 <w:rStyle w:val="aa"/>
                 <w:noProof/>
               </w:rPr>
-              <w:t>Результат работы</w:t>
+              <w:t>Исходный код программы</w:t>
             </w:r>
             <w:r>
               <w:rPr>
@@ -636,7 +650,7 @@
                 <w:noProof/>
                 <w:webHidden/>
               </w:rPr>
-              <w:instrText xml:space="preserve"> PAGEREF _Toc182062728 \h </w:instrText>
+              <w:instrText xml:space="preserve"> PAGEREF _Toc222415934 \h </w:instrText>
             </w:r>
             <w:r>
               <w:rPr>
@@ -656,7 +670,7 @@
                 <w:noProof/>
                 <w:webHidden/>
               </w:rPr>
-              <w:t>6</w:t>
+              <w:t>4</w:t>
             </w:r>
             <w:r>
               <w:rPr>
@@ -674,18 +688,19 @@
               <w:rFonts w:asciiTheme="minorHAnsi" w:eastAsiaTheme="minorEastAsia" w:hAnsiTheme="minorHAnsi"/>
               <w:noProof/>
               <w:kern w:val="2"/>
-              <w:sz w:val="22"/>
+              <w:sz w:val="24"/>
+              <w:szCs w:val="24"/>
               <w:lang w:eastAsia="ru-RU"/>
               <w14:ligatures w14:val="standardContextual"/>
             </w:rPr>
           </w:pPr>
-          <w:hyperlink w:anchor="_Toc182062729" w:history="1">
+          <w:hyperlink w:anchor="_Toc222415935" w:history="1">
             <w:r>
               <w:rPr>
                 <w:rStyle w:val="aa"/>
                 <w:noProof/>
               </w:rPr>
-              <w:t>Вывод</w:t>
+              <w:t>Результат работы</w:t>
             </w:r>
             <w:r>
               <w:rPr>
@@ -706,7 +721,78 @@
                 <w:noProof/>
                 <w:webHidden/>
               </w:rPr>
-              <w:instrText xml:space="preserve"> PAGEREF _Toc182062729 \h </w:instrText>
+              <w:instrText xml:space="preserve"> PAGEREF _Toc222415935 \h </w:instrText>
+            </w:r>
+            <w:r>
+              <w:rPr>
+                <w:noProof/>
+                <w:webHidden/>
+              </w:rPr>
+            </w:r>
+            <w:r>
+              <w:rPr>
+                <w:noProof/>
+                <w:webHidden/>
+              </w:rPr>
+              <w:fldChar w:fldCharType="separate"/>
+            </w:r>
+            <w:r>
+              <w:rPr>
+                <w:noProof/>
+                <w:webHidden/>
+              </w:rPr>
+              <w:t>6</w:t>
+            </w:r>
+            <w:r>
+              <w:rPr>
+                <w:noProof/>
+                <w:webHidden/>
+              </w:rPr>
+              <w:fldChar w:fldCharType="end"/>
+            </w:r>
+          </w:hyperlink>
+        </w:p>
+        <w:p>
+          <w:pPr>
+            <w:pStyle w:val="1"/>
+            <w:rPr>
+              <w:rFonts w:asciiTheme="minorHAnsi" w:eastAsiaTheme="minorEastAsia" w:hAnsiTheme="minorHAnsi"/>
+              <w:noProof/>
+              <w:kern w:val="2"/>
+              <w:sz w:val="24"/>
+              <w:szCs w:val="24"/>
+              <w:lang w:eastAsia="ru-RU"/>
+              <w14:ligatures w14:val="standardContextual"/>
+            </w:rPr>
+          </w:pPr>
+          <w:hyperlink w:anchor="_Toc222415936" w:history="1">
+            <w:r>
+              <w:rPr>
+                <w:rStyle w:val="aa"/>
+                <w:noProof/>
+              </w:rPr>
+              <w:t>Вывод</w:t>
+            </w:r>
+            <w:r>
+              <w:rPr>
+                <w:noProof/>
+                <w:webHidden/>
+              </w:rPr>
+              <w:tab/>
+            </w:r>
+            <w:r>
+              <w:rPr>
+                <w:noProof/>
+                <w:webHidden/>
+              </w:rPr>
+              <w:fldChar w:fldCharType="begin"/>
+            </w:r>
+            <w:r>
+              <w:rPr>
+                <w:noProof/>
+                <w:webHidden/>
+              </w:rPr>
+              <w:instrText xml:space="preserve"> PAGEREF _Toc222415936 \h </w:instrText>
             </w:r>
             <w:r>
               <w:rPr>
@@ -921,10 +1007,11 @@
       <w:pPr>
         <w:pStyle w:val="10"/>
       </w:pPr>
-      <w:r>
-        <w:lastRenderedPageBreak/>
+      <w:bookmarkStart w:id="5" w:name="_Toc222415932"/>
+      <w:r>
         <w:t>Цель</w:t>
       </w:r>
+      <w:bookmarkEnd w:id="5"/>
     </w:p>
     <w:p>
       <w:r>
@@ -947,9 +1034,11 @@
       <w:pPr>
         <w:pStyle w:val="10"/>
       </w:pPr>
+      <w:bookmarkStart w:id="6" w:name="_Toc222415933"/>
       <w:r>
         <w:t>Описание метода</w:t>
       </w:r>
+      <w:bookmarkEnd w:id="6"/>
     </w:p>
     <w:p>
       <w:r>
@@ -1072,7 +1161,6 @@
       <w:r>
         <w:t>де </w:t>
       </w:r>
-      <w:proofErr w:type="spellStart"/>
       <w:r>
         <w:rPr>
           <w:i/>
@@ -1088,7 +1176,6 @@
         </w:rPr>
         <w:t>ij</w:t>
       </w:r>
-      <w:proofErr w:type="spellEnd"/>
       <w:r>
         <w:t>​ – элементы матрицы </w:t>
       </w:r>
@@ -1102,7 +1189,6 @@
       <w:r>
         <w:t>, </w:t>
       </w:r>
-      <w:proofErr w:type="spellStart"/>
       <w:r>
         <w:rPr>
           <w:i/>
@@ -1118,7 +1204,6 @@
         </w:rPr>
         <w:t>i</w:t>
       </w:r>
-      <w:proofErr w:type="spellEnd"/>
       <w:r>
         <w:rPr>
           <w:i/>
@@ -1278,20 +1363,20 @@
       <w:pPr>
         <w:pStyle w:val="10"/>
         <w:rPr>
-          <w:ins w:id="4" w:author="Vasy Medov" w:date="2026-02-19T17:43:00Z"/>
-          <w:rPrChange w:id="5" w:author="Vasy Medov" w:date="2026-02-19T17:43:00Z">
+          <w:ins w:id="7" w:author="Vasy Medov" w:date="2026-02-19T17:43:00Z"/>
+          <w:rPrChange w:id="8" w:author="Vasy Medov" w:date="2026-02-19T17:43:00Z">
             <w:rPr>
-              <w:ins w:id="6" w:author="Vasy Medov" w:date="2026-02-19T17:43:00Z"/>
+              <w:ins w:id="9" w:author="Vasy Medov" w:date="2026-02-19T17:43:00Z"/>
               <w:lang w:val="en-US"/>
             </w:rPr>
           </w:rPrChange>
         </w:rPr>
       </w:pPr>
-      <w:bookmarkStart w:id="7" w:name="_Toc182062727"/>
+      <w:bookmarkStart w:id="10" w:name="_Toc222415934"/>
       <w:r>
         <w:t>Исходный код программы</w:t>
       </w:r>
-      <w:bookmarkEnd w:id="7"/>
+      <w:bookmarkEnd w:id="10"/>
     </w:p>
     <w:tbl>
       <w:tblPr>
@@ -1320,23 +1405,7 @@
               <w:pStyle w:val="af2"/>
             </w:pPr>
             <w:r>
-              <w:t xml:space="preserve">def </w:t>
-            </w:r>
-            <w:proofErr w:type="spellStart"/>
-            <w:r>
-              <w:t>calc_gauss_</w:t>
-            </w:r>
-            <w:proofErr w:type="gramStart"/>
-            <w:r>
-              <w:t>seidel</w:t>
-            </w:r>
-            <w:proofErr w:type="spellEnd"/>
-            <w:r>
-              <w:t>(</w:t>
-            </w:r>
-            <w:proofErr w:type="gramEnd"/>
-            <w:r>
-              <w:t>A, X, B, m=10, e=1e-2):</w:t>
+              <w:t>def calc_gauss_seidel(A, X, B, m=10, e=1e-2):</w:t>
             </w:r>
           </w:p>
           <w:p>
@@ -1389,11 +1458,9 @@
               </w:rPr>
               <w:t xml:space="preserve"> </w:t>
             </w:r>
-            <w:proofErr w:type="spellStart"/>
             <w:r>
               <w:t>Args</w:t>
             </w:r>
-            <w:proofErr w:type="spellEnd"/>
             <w:r>
               <w:rPr>
                 <w:lang w:val="ru-RU"/>
@@ -1652,21 +1719,7 @@
               <w:rPr>
                 <w:lang w:val="ru-RU"/>
               </w:rPr>
-              <w:t xml:space="preserve">): макс. </w:t>
-            </w:r>
-            <w:proofErr w:type="spellStart"/>
-            <w:r>
-              <w:rPr>
-                <w:lang w:val="ru-RU"/>
-              </w:rPr>
-              <w:t>колическо</w:t>
-            </w:r>
-            <w:proofErr w:type="spellEnd"/>
-            <w:r>
-              <w:rPr>
-                <w:lang w:val="ru-RU"/>
-              </w:rPr>
-              <w:t xml:space="preserve"> итераций приближений. </w:t>
+              <w:t xml:space="preserve">): макс. колическо итераций приближений. </w:t>
             </w:r>
             <w:r>
               <w:t>Defaults to 10.</w:t>
@@ -1677,23 +1730,7 @@
               <w:pStyle w:val="af2"/>
             </w:pPr>
             <w:r>
-              <w:t xml:space="preserve">        e (float, optional): </w:t>
-            </w:r>
-            <w:proofErr w:type="spellStart"/>
-            <w:r>
-              <w:t>допустимая</w:t>
-            </w:r>
-            <w:proofErr w:type="spellEnd"/>
-            <w:r>
-              <w:t xml:space="preserve"> </w:t>
-            </w:r>
-            <w:proofErr w:type="spellStart"/>
-            <w:r>
-              <w:t>погрешность</w:t>
-            </w:r>
-            <w:proofErr w:type="spellEnd"/>
-            <w:r>
-              <w:t>. Defaults to 1e-2.</w:t>
+              <w:t>        e (float, optional): допустимая погрешность. Defaults to 1e-2.</w:t>
             </w:r>
           </w:p>
           <w:p>
@@ -1741,15 +1778,7 @@
               <w:pStyle w:val="af2"/>
             </w:pPr>
             <w:r>
-              <w:t xml:space="preserve">        for </w:t>
-            </w:r>
-            <w:proofErr w:type="spellStart"/>
-            <w:r>
-              <w:t>i</w:t>
-            </w:r>
-            <w:proofErr w:type="spellEnd"/>
-            <w:r>
-              <w:t xml:space="preserve"> in range(n):</w:t>
+              <w:t>        for i in range(n):</w:t>
             </w:r>
           </w:p>
           <w:p>
@@ -1766,15 +1795,7 @@
             </w:pPr>
             <w:r>
               <w:lastRenderedPageBreak/>
-              <w:t>            for j in range(</w:t>
-            </w:r>
-            <w:proofErr w:type="spellStart"/>
-            <w:r>
-              <w:t>i</w:t>
-            </w:r>
-            <w:proofErr w:type="spellEnd"/>
-            <w:r>
-              <w:t>):</w:t>
+              <w:t>            for j in range(i):</w:t>
             </w:r>
           </w:p>
           <w:p>
@@ -1782,20 +1803,7 @@
               <w:pStyle w:val="af2"/>
             </w:pPr>
             <w:r>
-              <w:t xml:space="preserve">                s += </w:t>
-            </w:r>
-            <w:proofErr w:type="gramStart"/>
-            <w:r>
-              <w:t>A[</w:t>
-            </w:r>
-            <w:proofErr w:type="spellStart"/>
-            <w:proofErr w:type="gramEnd"/>
-            <w:r>
-              <w:t>i</w:t>
-            </w:r>
-            <w:proofErr w:type="spellEnd"/>
-            <w:r>
-              <w:t xml:space="preserve">, j] * X[j]   </w:t>
+              <w:t xml:space="preserve">                s += A[i, j] * X[j]   </w:t>
             </w:r>
           </w:p>
           <w:p>
@@ -1803,15 +1811,7 @@
               <w:pStyle w:val="af2"/>
             </w:pPr>
             <w:r>
-              <w:t xml:space="preserve">            for j in </w:t>
-            </w:r>
-            <w:proofErr w:type="gramStart"/>
-            <w:r>
-              <w:t>range(</w:t>
-            </w:r>
-            <w:proofErr w:type="gramEnd"/>
-            <w:r>
-              <w:t>i+1, n):</w:t>
+              <w:t>            for j in range(i+1, n):</w:t>
             </w:r>
           </w:p>
           <w:p>
@@ -1819,20 +1819,7 @@
               <w:pStyle w:val="af2"/>
             </w:pPr>
             <w:r>
-              <w:t xml:space="preserve">                s += </w:t>
-            </w:r>
-            <w:proofErr w:type="gramStart"/>
-            <w:r>
-              <w:t>A[</w:t>
-            </w:r>
-            <w:proofErr w:type="spellStart"/>
-            <w:proofErr w:type="gramEnd"/>
-            <w:r>
-              <w:t>i</w:t>
-            </w:r>
-            <w:proofErr w:type="spellEnd"/>
-            <w:r>
-              <w:t>, j] * X[j]</w:t>
+              <w:t>                s += A[i, j] * X[j]</w:t>
             </w:r>
           </w:p>
           <w:p>
@@ -1848,44 +1835,7 @@
               <w:pStyle w:val="af2"/>
             </w:pPr>
             <w:r>
-              <w:t xml:space="preserve">            </w:t>
-            </w:r>
-            <w:proofErr w:type="spellStart"/>
-            <w:r>
-              <w:t>new_x</w:t>
-            </w:r>
-            <w:proofErr w:type="spellEnd"/>
-            <w:r>
-              <w:t xml:space="preserve"> = (B[</w:t>
-            </w:r>
-            <w:proofErr w:type="spellStart"/>
-            <w:r>
-              <w:t>i</w:t>
-            </w:r>
-            <w:proofErr w:type="spellEnd"/>
-            <w:r>
-              <w:t xml:space="preserve">] - s) / </w:t>
-            </w:r>
-            <w:proofErr w:type="gramStart"/>
-            <w:r>
-              <w:t>A[</w:t>
-            </w:r>
-            <w:proofErr w:type="spellStart"/>
-            <w:proofErr w:type="gramEnd"/>
-            <w:r>
-              <w:t>i</w:t>
-            </w:r>
-            <w:proofErr w:type="spellEnd"/>
-            <w:r>
-              <w:t xml:space="preserve">, </w:t>
-            </w:r>
-            <w:proofErr w:type="spellStart"/>
-            <w:r>
-              <w:t>i</w:t>
-            </w:r>
-            <w:proofErr w:type="spellEnd"/>
-            <w:r>
-              <w:t>]</w:t>
+              <w:t>            new_x = (B[i] - s) / A[i, i]</w:t>
             </w:r>
           </w:p>
           <w:p>
@@ -1901,28 +1851,7 @@
               <w:pStyle w:val="af2"/>
             </w:pPr>
             <w:r>
-              <w:t xml:space="preserve">            d = </w:t>
-            </w:r>
-            <w:proofErr w:type="gramStart"/>
-            <w:r>
-              <w:t>abs(</w:t>
-            </w:r>
-            <w:proofErr w:type="spellStart"/>
-            <w:proofErr w:type="gramEnd"/>
-            <w:r>
-              <w:t>new_x</w:t>
-            </w:r>
-            <w:proofErr w:type="spellEnd"/>
-            <w:r>
-              <w:t xml:space="preserve"> - X[</w:t>
-            </w:r>
-            <w:proofErr w:type="spellStart"/>
-            <w:r>
-              <w:t>i</w:t>
-            </w:r>
-            <w:proofErr w:type="spellEnd"/>
-            <w:r>
-              <w:t>])</w:t>
+              <w:t>            d = abs(new_x - X[i])</w:t>
             </w:r>
           </w:p>
           <w:p>
@@ -1946,21 +1875,8 @@
               <w:pStyle w:val="af2"/>
             </w:pPr>
             <w:r>
-              <w:t>            X[</w:t>
-            </w:r>
-            <w:proofErr w:type="spellStart"/>
-            <w:r>
-              <w:t>i</w:t>
-            </w:r>
-            <w:proofErr w:type="spellEnd"/>
-            <w:r>
-              <w:t xml:space="preserve">] = </w:t>
-            </w:r>
-            <w:proofErr w:type="spellStart"/>
-            <w:r>
-              <w:t>new_x</w:t>
-            </w:r>
-            <w:proofErr w:type="spellEnd"/>
+              <w:t>            X[i] = new_x</w:t>
+            </w:r>
           </w:p>
           <w:p>
             <w:pPr>
@@ -1972,20 +1888,7 @@
               <w:pStyle w:val="af2"/>
             </w:pPr>
             <w:r>
-              <w:t xml:space="preserve">        </w:t>
-            </w:r>
-            <w:proofErr w:type="gramStart"/>
-            <w:r>
-              <w:t>print(</w:t>
-            </w:r>
-            <w:proofErr w:type="spellStart"/>
-            <w:proofErr w:type="gramEnd"/>
-            <w:r>
-              <w:t>f"Итерация</w:t>
-            </w:r>
-            <w:proofErr w:type="spellEnd"/>
-            <w:r>
-              <w:t xml:space="preserve"> {k}:")</w:t>
+              <w:t>        print(f"Итерация {k}:")</w:t>
             </w:r>
           </w:p>
           <w:p>
@@ -1993,15 +1896,7 @@
               <w:pStyle w:val="af2"/>
             </w:pPr>
             <w:r>
-              <w:t xml:space="preserve">        for </w:t>
-            </w:r>
-            <w:proofErr w:type="spellStart"/>
-            <w:r>
-              <w:t>i</w:t>
-            </w:r>
-            <w:proofErr w:type="spellEnd"/>
-            <w:r>
-              <w:t xml:space="preserve"> in range(n):</w:t>
+              <w:t>        for i in range(n):</w:t>
             </w:r>
           </w:p>
           <w:p>
@@ -2009,31 +1904,7 @@
               <w:pStyle w:val="af2"/>
             </w:pPr>
             <w:r>
-              <w:t xml:space="preserve">            </w:t>
-            </w:r>
-            <w:proofErr w:type="gramStart"/>
-            <w:r>
-              <w:t>print(</w:t>
-            </w:r>
-            <w:proofErr w:type="gramEnd"/>
-            <w:r>
-              <w:t>f"    x{i+1} = {</w:t>
-            </w:r>
-            <w:proofErr w:type="spellStart"/>
-            <w:r>
-              <w:t>X.copy</w:t>
-            </w:r>
-            <w:proofErr w:type="spellEnd"/>
-            <w:r>
-              <w:t>()[</w:t>
-            </w:r>
-            <w:proofErr w:type="spellStart"/>
-            <w:r>
-              <w:t>i</w:t>
-            </w:r>
-            <w:proofErr w:type="spellEnd"/>
-            <w:r>
-              <w:t>]:.10f}")</w:t>
+              <w:t>            print(f"    x{i+1} = {X.copy()[i]:.10f}")</w:t>
             </w:r>
           </w:p>
           <w:p>
@@ -2137,7 +2008,6 @@
               </w:rPr>
               <w:t xml:space="preserve"> </w:t>
             </w:r>
-            <w:proofErr w:type="gramStart"/>
             <w:r>
               <w:t>print</w:t>
             </w:r>
@@ -2147,7 +2017,6 @@
               </w:rPr>
               <w:t>(</w:t>
             </w:r>
-            <w:proofErr w:type="gramEnd"/>
             <w:r>
               <w:t>f</w:t>
             </w:r>
@@ -2225,29 +2094,8 @@
               </w:rPr>
               <w:t xml:space="preserve"> </w:t>
             </w:r>
-            <w:proofErr w:type="gramStart"/>
-            <w:r>
-              <w:t>print(</w:t>
-            </w:r>
-            <w:proofErr w:type="gramEnd"/>
-            <w:r>
-              <w:t>"</w:t>
-            </w:r>
-            <w:proofErr w:type="spellStart"/>
-            <w:r>
-              <w:t>Вектор</w:t>
-            </w:r>
-            <w:proofErr w:type="spellEnd"/>
-            <w:r>
-              <w:t xml:space="preserve"> </w:t>
-            </w:r>
-            <w:proofErr w:type="spellStart"/>
-            <w:r>
-              <w:t>неизвестных</w:t>
-            </w:r>
-            <w:proofErr w:type="spellEnd"/>
-            <w:r>
-              <w:t>:")</w:t>
+            <w:r>
+              <w:t>print("Вектор неизвестных:")</w:t>
             </w:r>
           </w:p>
           <w:p>
@@ -2255,15 +2103,7 @@
               <w:pStyle w:val="af2"/>
             </w:pPr>
             <w:r>
-              <w:t xml:space="preserve">            for </w:t>
-            </w:r>
-            <w:proofErr w:type="spellStart"/>
-            <w:r>
-              <w:t>i</w:t>
-            </w:r>
-            <w:proofErr w:type="spellEnd"/>
-            <w:r>
-              <w:t xml:space="preserve"> in range(n):</w:t>
+              <w:t>            for i in range(n):</w:t>
             </w:r>
           </w:p>
           <w:p>
@@ -2271,23 +2111,7 @@
               <w:pStyle w:val="af2"/>
             </w:pPr>
             <w:r>
-              <w:t>                print(</w:t>
-            </w:r>
-            <w:proofErr w:type="spellStart"/>
-            <w:r>
-              <w:t>f"x</w:t>
-            </w:r>
-            <w:proofErr w:type="spellEnd"/>
-            <w:r>
-              <w:t>{i+1} = {X[</w:t>
-            </w:r>
-            <w:proofErr w:type="spellStart"/>
-            <w:r>
-              <w:t>i</w:t>
-            </w:r>
-            <w:proofErr w:type="spellEnd"/>
-            <w:r>
-              <w:t>]:.10f}")</w:t>
+              <w:t>                print(f"x{i+1} = {X[i]:.10f}")</w:t>
             </w:r>
           </w:p>
           <w:p>
@@ -2490,7 +2314,6 @@
               </w:rPr>
               <w:t xml:space="preserve"> </w:t>
             </w:r>
-            <w:proofErr w:type="gramStart"/>
             <w:r>
               <w:t>print</w:t>
             </w:r>
@@ -2498,14 +2321,7 @@
               <w:rPr>
                 <w:lang w:val="ru-RU"/>
               </w:rPr>
-              <w:t>(</w:t>
-            </w:r>
-            <w:proofErr w:type="gramEnd"/>
-            <w:r>
-              <w:rPr>
-                <w:lang w:val="ru-RU"/>
-              </w:rPr>
-              <w:t>"Итерации расходятся")</w:t>
+              <w:t>("Итерации расходятся")</w:t>
             </w:r>
           </w:p>
           <w:p>
@@ -2604,7 +2420,7 @@
     <w:p>
       <w:pPr>
         <w:pStyle w:val="af2"/>
-        <w:pPrChange w:id="8" w:author="Vasy Medov" w:date="2026-02-19T17:43:00Z">
+        <w:pPrChange w:id="11" w:author="Vasy Medov" w:date="2026-02-19T17:43:00Z">
           <w:pPr>
             <w:pStyle w:val="10"/>
           </w:pPr>
@@ -2634,7 +2450,6 @@
           <w:t>Код вычислительного метода</w:t>
         </w:r>
       </w:hyperlink>
-      <w:bookmarkStart w:id="9" w:name="_Toc182062728"/>
     </w:p>
     <w:p>
       <w:pPr>
@@ -2657,11 +2472,12 @@
       <w:pPr>
         <w:pStyle w:val="10"/>
       </w:pPr>
+      <w:bookmarkStart w:id="12" w:name="_Toc222415935"/>
       <w:r>
         <w:lastRenderedPageBreak/>
         <w:t>Результат работы</w:t>
       </w:r>
-      <w:bookmarkEnd w:id="9"/>
+      <w:bookmarkEnd w:id="12"/>
     </w:p>
     <w:p>
       <w:pPr>
@@ -2773,24 +2589,20 @@
           <w:lang w:val="en-US"/>
         </w:rPr>
       </w:pPr>
-      <w:bookmarkStart w:id="10" w:name="_Toc182062729"/>
     </w:p>
     <w:p>
       <w:pPr>
         <w:pStyle w:val="10"/>
       </w:pPr>
+      <w:bookmarkStart w:id="13" w:name="_Toc222415936"/>
       <w:r>
         <w:t>Вывод</w:t>
       </w:r>
-      <w:bookmarkEnd w:id="10"/>
-    </w:p>
-    <w:p>
-      <w:r>
-        <w:t xml:space="preserve">Проделав </w:t>
-      </w:r>
-      <w:proofErr w:type="gramStart"/>
-      <w:r>
-        <w:t>данную лабораторную работу</w:t>
+      <w:bookmarkEnd w:id="13"/>
+    </w:p>
+    <w:p>
+      <w:r>
+        <w:t>Проделав данную лабораторную работу</w:t>
       </w:r>
       <w:r>
         <w:t xml:space="preserve"> №</w:t>
@@ -2798,7 +2610,6 @@
       <w:r>
         <w:t>1</w:t>
       </w:r>
-      <w:proofErr w:type="gramEnd"/>
       <w:r>
         <w:rPr>
           <w:b/>
@@ -2828,7 +2639,7 @@
         <w:ind w:left="0" w:firstLine="0"/>
         <w:rPr>
           <w:noProof/>
-          <w:rPrChange w:id="11" w:author="Vasy Medov" w:date="2026-02-19T00:03:00Z">
+          <w:rPrChange w:id="14" w:author="Vasy Medov" w:date="2026-02-19T00:03:00Z">
             <w:rPr>
               <w:noProof/>
               <w:lang w:val="en-US"/>
@@ -2845,7 +2656,7 @@
         <w:rPr>
           <w:lang w:val="en-US"/>
         </w:rPr>
-        <w:pPrChange w:id="12" w:author="Vasy Medov" w:date="2026-02-18T21:23:00Z">
+        <w:pPrChange w:id="15" w:author="Vasy Medov" w:date="2026-02-18T21:23:00Z">
           <w:pPr>
             <w:pStyle w:val="ad"/>
             <w:ind w:left="0" w:firstLine="0"/>
@@ -2857,7 +2668,7 @@
           <w:noProof/>
         </w:rPr>
         <w:drawing>
-          <wp:inline distT="0" distB="0" distL="0" distR="0" wp14:anchorId="3350B4AD" wp14:editId="0C13D920">
+          <wp:inline distT="0" distB="0" distL="0" distR="0" wp14:anchorId="3350B4AD" wp14:editId="3CFACD44">
             <wp:extent cx="1883583" cy="1905532"/>
             <wp:effectExtent l="0" t="0" r="2540" b="0"/>
             <wp:docPr id="7" name="Рисунок 7"/>
@@ -4828,6 +4639,7 @@
   <w:style w:type="character" w:default="1" w:styleId="a1">
     <w:name w:val="Default Paragraph Font"/>
     <w:uiPriority w:val="1"/>
+    <w:semiHidden/>
     <w:unhideWhenUsed/>
   </w:style>
   <w:style w:type="table" w:default="1" w:styleId="a2">

</xml_diff>